<commit_message>
Updated documentation and increased the idata to 500 lines
</commit_message>
<xml_diff>
--- a/Docs/Prawler Firmware Documentation.docx
+++ b/Docs/Prawler Firmware Documentation.docx
@@ -116,29 +116,6 @@
         <w:t>SD Card/FATFS</w:t>
       </w:r>
     </w:p>
-    <w:p/>
-    <w:p>
-      <w:r>
-        <w:br w:type="page"/>
-      </w:r>
-    </w:p>
-    <w:p>
-      <w:pPr>
-        <w:pStyle w:val="Heading2"/>
-      </w:pPr>
-      <w:r>
-        <w:lastRenderedPageBreak/>
-        <w:t>Sensor Drivers</w:t>
-      </w:r>
-    </w:p>
-    <w:p>
-      <w:pPr>
-        <w:pStyle w:val="Heading3"/>
-      </w:pPr>
-      <w:r>
-        <w:t>CTD</w:t>
-      </w:r>
-    </w:p>
     <w:p>
       <w:r>
         <w:rPr>
@@ -148,6 +125,92 @@
         <w:t>Firmware Files:</w:t>
       </w:r>
       <w:r>
+        <w:rPr>
+          <w:b/>
+          <w:bCs/>
+        </w:rPr>
+        <w:br/>
+      </w:r>
+      <w:r>
+        <w:t>Core/Inc/</w:t>
+      </w:r>
+      <w:proofErr w:type="spellStart"/>
+      <w:r>
+        <w:t>sd_spi.h</w:t>
+      </w:r>
+      <w:proofErr w:type="spellEnd"/>
+      <w:r>
+        <w:br/>
+        <w:t>Core/</w:t>
+      </w:r>
+      <w:proofErr w:type="spellStart"/>
+      <w:r>
+        <w:t>Src</w:t>
+      </w:r>
+      <w:proofErr w:type="spellEnd"/>
+      <w:r>
+        <w:t>/</w:t>
+      </w:r>
+      <w:proofErr w:type="spellStart"/>
+      <w:r>
+        <w:t>sd_spi.c</w:t>
+      </w:r>
+      <w:proofErr w:type="spellEnd"/>
+      <w:r>
+        <w:br/>
+      </w:r>
+      <w:r>
+        <w:t>FATFS/App/</w:t>
+      </w:r>
+      <w:proofErr w:type="spellStart"/>
+      <w:r>
+        <w:t>fatfs.</w:t>
+      </w:r>
+      <w:r>
+        <w:t>c</w:t>
+      </w:r>
+      <w:proofErr w:type="spellEnd"/>
+      <w:r>
+        <w:br/>
+        <w:t>FATFS/Target/</w:t>
+      </w:r>
+      <w:proofErr w:type="spellStart"/>
+      <w:r>
+        <w:t>user_diskio.c</w:t>
+      </w:r>
+      <w:proofErr w:type="spellEnd"/>
+    </w:p>
+    <w:p>
+      <w:r>
+        <w:br w:type="page"/>
+      </w:r>
+    </w:p>
+    <w:p>
+      <w:pPr>
+        <w:pStyle w:val="Heading2"/>
+      </w:pPr>
+      <w:r>
+        <w:lastRenderedPageBreak/>
+        <w:t>Sensor Drivers</w:t>
+      </w:r>
+    </w:p>
+    <w:p>
+      <w:pPr>
+        <w:pStyle w:val="Heading3"/>
+      </w:pPr>
+      <w:r>
+        <w:t>CTD</w:t>
+      </w:r>
+    </w:p>
+    <w:p>
+      <w:r>
+        <w:rPr>
+          <w:b/>
+          <w:bCs/>
+        </w:rPr>
+        <w:t>Firmware Files:</w:t>
+      </w:r>
+      <w:r>
         <w:t xml:space="preserve"> </w:t>
       </w:r>
       <w:r>
@@ -226,6 +289,21 @@
         <w:t>Pressure – float</w:t>
       </w:r>
     </w:p>
+    <w:p>
+      <w:pPr>
+        <w:rPr>
+          <w:b/>
+          <w:bCs/>
+        </w:rPr>
+      </w:pPr>
+      <w:r>
+        <w:rPr>
+          <w:b/>
+          <w:bCs/>
+        </w:rPr>
+        <w:t>Driver Function:</w:t>
+      </w:r>
+    </w:p>
     <w:p/>
     <w:p>
       <w:pPr>
@@ -392,6 +470,13 @@
     </w:p>
     <w:p>
       <w:r>
+        <w:rPr>
+          <w:b/>
+          <w:bCs/>
+        </w:rPr>
+        <w:t>Driver Function:</w:t>
+      </w:r>
+      <w:r>
         <w:br/>
       </w:r>
       <w:r>
@@ -553,7 +638,21 @@
         <w:t xml:space="preserve"> Thermistor: uint16_t</w:t>
       </w:r>
     </w:p>
-    <w:p/>
+    <w:p>
+      <w:pPr>
+        <w:rPr>
+          <w:b/>
+          <w:bCs/>
+        </w:rPr>
+      </w:pPr>
+      <w:r>
+        <w:rPr>
+          <w:b/>
+          <w:bCs/>
+        </w:rPr>
+        <w:t>Driver Function:</w:t>
+      </w:r>
+    </w:p>
     <w:p/>
     <w:p>
       <w:pPr>

</xml_diff>